<commit_message>
Replace Tally boundary with ERPNext integration
</commit_message>
<xml_diff>
--- a/docs/ERP_Technical_Blueprint_v2.docx
+++ b/docs/ERP_Technical_Blueprint_v2.docx
@@ -718,7 +718,7 @@
         <w:spacing w:after="60"/>
       </w:pPr>
       <w:r>
-        <w:t xml:space="preserve">Tally as accounting book of record.</w:t>
+        <w:t>ERPNext as the separately deployed statutory accounting book of record.</w:t>
       </w:r>
     </w:p>
     <w:p>
@@ -1320,7 +1320,7 @@
         <w:spacing w:after="60"/>
       </w:pPr>
       <w:r>
-        <w:t xml:space="preserve">Finance operations and Tally reconciliation.</w:t>
+        <w:t>Finance operations and provider-neutral external-ledger reconciliation, with ERPNext as the selected adapter.</w:t>
       </w:r>
     </w:p>
     <w:p>
@@ -2652,7 +2652,7 @@
         <w:spacing w:after="60"/>
       </w:pPr>
       <w:r>
-        <w:t xml:space="preserve">Tally import.</w:t>
+        <w:t>Controlled ERPNext synchronization through the External Ledger boundary.</w:t>
       </w:r>
     </w:p>
     <w:p>
@@ -3463,7 +3463,7 @@
         <w:spacing w:after="160" w:before="340"/>
       </w:pPr>
       <w:r>
-        <w:t xml:space="preserve">16. Tally Reconciliation</w:t>
+        <w:t>16. External Ledger and ERPNext Integration</w:t>
       </w:r>
     </w:p>
     <w:p>
@@ -3485,13 +3485,7 @@
         <w:spacing w:after="160"/>
       </w:pPr>
       <w:r>
-        <w:rPr>
-          <w:b w:val="false"/>
-          <w:bCs w:val="false"/>
-          <w:i w:val="false"/>
-          <w:iCs w:val="false"/>
-        </w:rPr>
-        <w:t xml:space="preserve">Authoritative boundaries: statutory books in Tally; operational commitments, purchase orders, contract milestones, project budgets, and reconciliation status in the ERP; posted vouchers in Tally.</w:t>
+        <w:t>Authoritative boundaries: statutory books, submitted accounting documents, and financial statements in ERPNext; identity, scoped authorization, operational commitments, approvals, controlled evidence, mappings, reconciliation status, and hash-chained audit in Atlas. ERPNext/Frappe is a separate deployable and Atlas never writes its MariaDB tables directly.</w:t>
       </w:r>
     </w:p>
     <w:p>
@@ -3499,11 +3493,7 @@
         <w:spacing w:after="160"/>
       </w:pPr>
       <w:r>
-        <w:rPr>
-          <w:i/>
-          <w:iCs/>
-        </w:rPr>
-        <w:t xml:space="preserve">Tally export → upload → validation → entity mapping → ledger mapping → voucher import → matching → discrepancy detection → accountant review → reconciliation</w:t>
+        <w:t>ERPNext API or controlled export → digest-addressed Ledger Sync Batch → schema and completeness validation → approved company/account/project/tax mappings → normalized External Vouchers → deterministic matching → discrepancy detection → independent accountant review → reconciliation. Initial integration is read-only; future posting requires a durable outbox, immutable receipt, stable idempotency key, maker-checker approval, step-up policy, and explicit production authorization.</w:t>
       </w:r>
     </w:p>
     <w:p>
@@ -3511,13 +3501,7 @@
         <w:spacing w:after="160"/>
       </w:pPr>
       <w:r>
-        <w:rPr>
-          <w:b w:val="false"/>
-          <w:bCs w:val="false"/>
-          <w:i w:val="false"/>
-          <w:iCs w:val="false"/>
-        </w:rPr>
-        <w:t xml:space="preserve">Examples of discrepancies: ERP invoice missing in Tally, Tally payment missing in ERP, amount mismatch, wrong legal entity, wrong project allocation, duplicate voucher, customer receipt not allocated, EMI posted but schedule not updated, authority fee paid but obligation still open.</w:t>
+        <w:t>Examples of discrepancies: Atlas commitment missing in the External Ledger, ERPNext voucher missing in Atlas, amount mismatch, wrong legal entity, wrong project allocation, duplicate voucher, customer receipt not allocated, EMI posted but schedule not updated, or authority fee paid while the Atlas obligation remains open. Raw provider payloads, narration, credentials, bank data, tax identifiers, and personal information are excluded from logs and audit events.</w:t>
       </w:r>
     </w:p>
     <w:p>
@@ -4760,17 +4744,8 @@
             <w:tcW w:type="dxa" w:w="7920"/>
           </w:tcPr>
           <w:p>
-            <w:pPr>
-              <w:spacing w:after="40"/>
-            </w:pPr>
-            <w:r>
-              <w:rPr>
-                <w:b w:val="false"/>
-                <w:bCs w:val="false"/>
-                <w:sz w:val="19"/>
-                <w:szCs w:val="19"/>
-              </w:rPr>
-              <w:t xml:space="preserve">Tally reconciliation.</w:t>
+            <w:r>
+              <w:t>ERPNext external-ledger synchronization and reconciliation.</w:t>
             </w:r>
           </w:p>
         </w:tc>
@@ -5094,7 +5069,7 @@
         <w:spacing w:after="60"/>
       </w:pPr>
       <w:r>
-        <w:t xml:space="preserve">Tally reconciliation.</w:t>
+        <w:t>ERPNext external-ledger synchronization and reconciliation.</w:t>
       </w:r>
     </w:p>
     <w:p>

</xml_diff>